<commit_message>
trying to get website to launch properly
</commit_message>
<xml_diff>
--- a/docs/index.docx
+++ b/docs/index.docx
@@ -63,7 +63,7 @@
         <w:pStyle w:val="Date"/>
       </w:pPr>
       <w:r>
-        <w:t xml:space="preserve">2026-04-08</w:t>
+        <w:t xml:space="preserve">2026-04-09</w:t>
       </w:r>
     </w:p>
     <w:bookmarkStart w:id="20" w:name="contributions"/>
@@ -1189,12 +1189,136 @@
       </w:r>
     </w:p>
     <w:bookmarkEnd w:id="65"/>
-    <w:bookmarkStart w:id="67" w:name="acknowledgments"/>
+    <w:bookmarkStart w:id="66" w:name="related-github-repositories"/>
     <w:p>
       <w:pPr>
         <w:pStyle w:val="Heading1"/>
       </w:pPr>
       <w:r>
+        <w:t xml:space="preserve">Related Github Repositories</w:t>
+      </w:r>
+    </w:p>
+    <w:p>
+      <w:pPr>
+        <w:pStyle w:val="Compact"/>
+        <w:numPr>
+          <w:ilvl w:val="0"/>
+          <w:numId w:val="1001"/>
+        </w:numPr>
+      </w:pPr>
+      <w:r>
+        <w:t xml:space="preserve">LED backlights: https://github.com/janelia-experimental-technology/RGB-IR-LED-Boards</w:t>
+      </w:r>
+    </w:p>
+    <w:p>
+      <w:pPr>
+        <w:pStyle w:val="Compact"/>
+        <w:numPr>
+          <w:ilvl w:val="0"/>
+          <w:numId w:val="1001"/>
+        </w:numPr>
+      </w:pPr>
+      <w:r>
+        <w:t xml:space="preserve">Design Files for Rig Components: https://github.com/otopalik-lab/Universal-Fly-Rig-CAD</w:t>
+      </w:r>
+    </w:p>
+    <w:p>
+      <w:pPr>
+        <w:pStyle w:val="Compact"/>
+        <w:numPr>
+          <w:ilvl w:val="0"/>
+          <w:numId w:val="1001"/>
+        </w:numPr>
+      </w:pPr>
+      <w:r>
+        <w:t xml:space="preserve">Video Acquisition Software: BIAS https://github.com/kristinbranson/BIASJAABA</w:t>
+      </w:r>
+    </w:p>
+    <w:p>
+      <w:pPr>
+        <w:pStyle w:val="Compact"/>
+        <w:numPr>
+          <w:ilvl w:val="0"/>
+          <w:numId w:val="1001"/>
+        </w:numPr>
+      </w:pPr>
+      <w:r>
+        <w:t xml:space="preserve">Operating Software for Universal Behavior Rigs with RGB LED Boards: https://github.com/otopalik-lab/UniversalRig_RGB</w:t>
+      </w:r>
+    </w:p>
+    <w:p>
+      <w:pPr>
+        <w:pStyle w:val="Compact"/>
+        <w:numPr>
+          <w:ilvl w:val="0"/>
+          <w:numId w:val="1001"/>
+        </w:numPr>
+      </w:pPr>
+      <w:r>
+        <w:t xml:space="preserve">Operating Software for Universal Behavior Rigs with RGG LED Boards: https://github.com/otopalik-lab/UniversalRig_RGG</w:t>
+      </w:r>
+    </w:p>
+    <w:p>
+      <w:pPr>
+        <w:pStyle w:val="Compact"/>
+        <w:numPr>
+          <w:ilvl w:val="0"/>
+          <w:numId w:val="1001"/>
+        </w:numPr>
+      </w:pPr>
+      <w:r>
+        <w:t xml:space="preserve">Video Processing &amp; Animal Tracking Pipeline:</w:t>
+      </w:r>
+      <w:r>
+        <w:t xml:space="preserve"> </w:t>
+      </w:r>
+      <w:r>
+        <w:t xml:space="preserve">FlyDiscoAnalysis https://github.com/kristinbranson/FlyDiscoAnalysis</w:t>
+      </w:r>
+      <w:r>
+        <w:t xml:space="preserve"> </w:t>
+      </w:r>
+      <w:r>
+        <w:t xml:space="preserve">FlyTracker https://github.com/kristinbranson/FlyTracker</w:t>
+      </w:r>
+      <w:r>
+        <w:t xml:space="preserve"> </w:t>
+      </w:r>
+      <w:r>
+        <w:t xml:space="preserve">JAABA: Janelia Automatic Animal Behavior Annotator https://github.com/kristinbranson/JAABA</w:t>
+      </w:r>
+    </w:p>
+    <w:p>
+      <w:pPr>
+        <w:pStyle w:val="Compact"/>
+        <w:numPr>
+          <w:ilvl w:val="0"/>
+          <w:numId w:val="1001"/>
+        </w:numPr>
+      </w:pPr>
+      <w:r>
+        <w:t xml:space="preserve">Repository for Data Analysis in pC1 Driver Line Behavioral Screen: https://github.com/otopalik-lab/pC1BehavioralAnalysis</w:t>
+      </w:r>
+    </w:p>
+    <w:p>
+      <w:pPr>
+        <w:pStyle w:val="Compact"/>
+        <w:numPr>
+          <w:ilvl w:val="0"/>
+          <w:numId w:val="1001"/>
+        </w:numPr>
+      </w:pPr>
+      <w:r>
+        <w:t xml:space="preserve">Otopalik Lab Github: https://github.com/otopalik-lab</w:t>
+      </w:r>
+    </w:p>
+    <w:bookmarkEnd w:id="66"/>
+    <w:bookmarkStart w:id="68" w:name="acknowledgments"/>
+    <w:p>
+      <w:pPr>
+        <w:pStyle w:val="Heading1"/>
+      </w:pPr>
+      <w:r>
         <w:t xml:space="preserve">Acknowledgments</w:t>
       </w:r>
     </w:p>
@@ -1208,7 +1332,7 @@
       <w:r>
         <w:t xml:space="preserve"> </w:t>
       </w:r>
-      <w:hyperlink r:id="rId66">
+      <w:hyperlink r:id="rId67">
         <w:r>
           <w:rPr>
             <w:rStyle w:val="Hyperlink"/>
@@ -1254,8 +1378,8 @@
         <w:t xml:space="preserve">.</w:t>
       </w:r>
     </w:p>
-    <w:bookmarkEnd w:id="67"/>
-    <w:bookmarkStart w:id="73" w:name="references"/>
+    <w:bookmarkEnd w:id="68"/>
+    <w:bookmarkStart w:id="74" w:name="references"/>
     <w:p>
       <w:pPr>
         <w:pStyle w:val="Heading1"/>
@@ -1264,8 +1388,8 @@
         <w:t xml:space="preserve">References</w:t>
       </w:r>
     </w:p>
-    <w:bookmarkStart w:id="72" w:name="refs"/>
-    <w:bookmarkStart w:id="69" w:name="ref-robie_fly_2024"/>
+    <w:bookmarkStart w:id="73" w:name="refs"/>
+    <w:bookmarkStart w:id="70" w:name="ref-robie_fly_2024"/>
     <w:p>
       <w:pPr>
         <w:pStyle w:val="Bibliography"/>
@@ -1352,7 +1476,7 @@
       <w:r>
         <w:t xml:space="preserve"> </w:t>
       </w:r>
-      <w:hyperlink r:id="rId68">
+      <w:hyperlink r:id="rId69">
         <w:r>
           <w:rPr>
             <w:rStyle w:val="Hyperlink"/>
@@ -1361,8 +1485,8 @@
         </w:r>
       </w:hyperlink>
     </w:p>
-    <w:bookmarkEnd w:id="69"/>
-    <w:bookmarkStart w:id="71" w:name="ref-rubin_networks_2025"/>
+    <w:bookmarkEnd w:id="70"/>
+    <w:bookmarkStart w:id="72" w:name="ref-rubin_networks_2025"/>
     <w:p>
       <w:pPr>
         <w:pStyle w:val="Bibliography"/>
@@ -1400,7 +1524,7 @@
       <w:r>
         <w:t xml:space="preserve"> </w:t>
       </w:r>
-      <w:hyperlink r:id="rId70">
+      <w:hyperlink r:id="rId71">
         <w:r>
           <w:rPr>
             <w:rStyle w:val="Hyperlink"/>
@@ -1409,9 +1533,9 @@
         </w:r>
       </w:hyperlink>
     </w:p>
-    <w:bookmarkEnd w:id="71"/>
     <w:bookmarkEnd w:id="72"/>
     <w:bookmarkEnd w:id="73"/>
+    <w:bookmarkEnd w:id="74"/>
     <w:sectPr>
       <w:footnotePr>
         <w:numRestart w:val="eachSect"/>
@@ -1522,8 +1646,123 @@
       </w:pPr>
     </w:lvl>
   </w:abstractNum>
+  <w:abstractNum w:abstractNumId="99411">
+    <w:nsid w:val="00A99411"/>
+    <w:multiLevelType w:val="multilevel"/>
+    <w:lvl w:ilvl="0">
+      <w:start w:val="1"/>
+      <w:numFmt w:val="decimal"/>
+      <w:lvlText w:val="%1."/>
+      <w:lvlJc w:val="left"/>
+      <w:pPr>
+        <w:ind w:left="720" w:hanging="360"/>
+      </w:pPr>
+    </w:lvl>
+    <w:lvl w:ilvl="1">
+      <w:start w:val="1"/>
+      <w:numFmt w:val="decimal"/>
+      <w:lvlText w:val="%2."/>
+      <w:lvlJc w:val="left"/>
+      <w:pPr>
+        <w:ind w:left="1440" w:hanging="360"/>
+      </w:pPr>
+    </w:lvl>
+    <w:lvl w:ilvl="2">
+      <w:start w:val="1"/>
+      <w:numFmt w:val="decimal"/>
+      <w:lvlText w:val="%3."/>
+      <w:lvlJc w:val="left"/>
+      <w:pPr>
+        <w:ind w:left="2160" w:hanging="360"/>
+      </w:pPr>
+    </w:lvl>
+    <w:lvl w:ilvl="3">
+      <w:start w:val="1"/>
+      <w:numFmt w:val="decimal"/>
+      <w:lvlText w:val="%4."/>
+      <w:lvlJc w:val="left"/>
+      <w:pPr>
+        <w:ind w:left="2880" w:hanging="360"/>
+      </w:pPr>
+    </w:lvl>
+    <w:lvl w:ilvl="4">
+      <w:start w:val="1"/>
+      <w:numFmt w:val="decimal"/>
+      <w:lvlText w:val="%5."/>
+      <w:lvlJc w:val="left"/>
+      <w:pPr>
+        <w:ind w:left="3600" w:hanging="360"/>
+      </w:pPr>
+    </w:lvl>
+    <w:lvl w:ilvl="5">
+      <w:start w:val="1"/>
+      <w:numFmt w:val="decimal"/>
+      <w:lvlText w:val="%6."/>
+      <w:lvlJc w:val="left"/>
+      <w:pPr>
+        <w:ind w:left="4320" w:hanging="360"/>
+      </w:pPr>
+    </w:lvl>
+    <w:lvl w:ilvl="6">
+      <w:start w:val="1"/>
+      <w:numFmt w:val="decimal"/>
+      <w:lvlText w:val="%7."/>
+      <w:lvlJc w:val="left"/>
+      <w:pPr>
+        <w:ind w:left="5040" w:hanging="360"/>
+      </w:pPr>
+    </w:lvl>
+    <w:lvl w:ilvl="7">
+      <w:start w:val="1"/>
+      <w:numFmt w:val="decimal"/>
+      <w:lvlText w:val="%8."/>
+      <w:lvlJc w:val="left"/>
+      <w:pPr>
+        <w:ind w:left="5760" w:hanging="360"/>
+      </w:pPr>
+    </w:lvl>
+    <w:lvl w:ilvl="8">
+      <w:start w:val="1"/>
+      <w:numFmt w:val="decimal"/>
+      <w:lvlText w:val="%9."/>
+      <w:lvlJc w:val="left"/>
+      <w:pPr>
+        <w:ind w:left="6480" w:hanging="360"/>
+      </w:pPr>
+    </w:lvl>
+  </w:abstractNum>
   <w:num w:numId="1000">
     <w:abstractNumId w:val="990"/>
+  </w:num>
+  <w:num w:numId="1001">
+    <w:abstractNumId w:val="99411"/>
+    <w:lvlOverride w:ilvl="0">
+      <w:startOverride w:val="1"/>
+    </w:lvlOverride>
+    <w:lvlOverride w:ilvl="1">
+      <w:startOverride w:val="1"/>
+    </w:lvlOverride>
+    <w:lvlOverride w:ilvl="2">
+      <w:startOverride w:val="1"/>
+    </w:lvlOverride>
+    <w:lvlOverride w:ilvl="3">
+      <w:startOverride w:val="1"/>
+    </w:lvlOverride>
+    <w:lvlOverride w:ilvl="4">
+      <w:startOverride w:val="1"/>
+    </w:lvlOverride>
+    <w:lvlOverride w:ilvl="5">
+      <w:startOverride w:val="1"/>
+    </w:lvlOverride>
+    <w:lvlOverride w:ilvl="6">
+      <w:startOverride w:val="1"/>
+    </w:lvlOverride>
+    <w:lvlOverride w:ilvl="7">
+      <w:startOverride w:val="1"/>
+    </w:lvlOverride>
+    <w:lvlOverride w:ilvl="8">
+      <w:startOverride w:val="1"/>
+    </w:lvlOverride>
   </w:num>
 </w:numbering>
 </file>

</xml_diff>